<commit_message>
v1.6.0: judgement continuity, task dossier, controlled skill learning
</commit_message>
<xml_diff>
--- a/docs/architecture-机制清单.docx
+++ b/docs/architecture-机制清单.docx
@@ -373,7 +373,7 @@
           <w:rFonts w:ascii="Microsoft YaHei" w:hAnsi="Microsoft YaHei" w:eastAsia="Microsoft YaHei"/>
           <w:lang w:val="en-US" w:eastAsia="zh-CN"/>
         </w:rPr>
-        <w:t>热/冷分层、闲置降权、按会话合并成一条会话存档（原始降为冷存保留）；存档型记录在召回里降权（关键词分打折 + 同等条件下让位），不会挤掉精确的小记录</w:t>
+        <w:t>热/冷分层、闲置降权、按会话合并成一条会话存档（原始降为冷存保留）；存档型记录默认不进召回（includeArchives:true 才放回），避免错召回吃掉大量上下文</w:t>
       </w:r>
     </w:p>
     <w:p>
@@ -394,7 +394,7 @@
           <w:rFonts w:ascii="Microsoft YaHei" w:hAnsi="Microsoft YaHei" w:eastAsia="Microsoft YaHei"/>
           <w:lang w:val="en-US" w:eastAsia="zh-CN"/>
         </w:rPr>
-        <w:t>归档后仍可检索，但不再默认注入；存档"降权不是过滤"，只有它匹配时照样召得回</w:t>
+        <w:t>归档后可 open(id) 或显式查；任务收尾结论会作为"任务"一节进存档</w:t>
       </w:r>
     </w:p>
     <w:p>
@@ -1175,7 +1175,7 @@
           <w:rFonts w:ascii="Microsoft YaHei" w:hAnsi="Microsoft YaHei" w:eastAsia="Microsoft YaHei"/>
           <w:lang w:val="en-US" w:eastAsia="zh-CN"/>
         </w:rPr>
-        <w:t>大折叠发生时把被遮蔽区抽成一条记忆（工具失败 / 用户原话 / 负面结论 + 有界原文）</w:t>
+        <w:t>大折叠发生时把被遮蔽区抽成事实卡（工具失败 / 用户原话 / 负面结论；不存 4K 原文），7 天 TTL 自动清理</w:t>
       </w:r>
     </w:p>
     <w:p>
@@ -1196,7 +1196,7 @@
           <w:rFonts w:ascii="Microsoft YaHei" w:hAnsi="Microsoft YaHei" w:eastAsia="Microsoft YaHei"/>
           <w:lang w:val="en-US" w:eastAsia="zh-CN"/>
         </w:rPr>
-        <w:t>不保证"结论不丢"；保底原文有字数上限</w:t>
+        <w:t>不保证"结论不丢"；事实卡只保留有界条目，原文仍在会话日志</w:t>
       </w:r>
     </w:p>
     <w:p>
@@ -1230,7 +1230,7 @@
           <w:rFonts w:ascii="Microsoft YaHei" w:hAnsi="Microsoft YaHei" w:eastAsia="Microsoft YaHei"/>
           <w:lang w:val="en-US" w:eastAsia="zh-CN"/>
         </w:rPr>
-        <w:t>折叠后模型知道"东西存在哪"，而不是两眼一抹黑</w:t>
+        <w:t>折叠后模型知道"东西存在哪"，且最高价值事实不靠二次动作</w:t>
       </w:r>
     </w:p>
     <w:p>
@@ -1251,7 +1251,7 @@
           <w:rFonts w:ascii="Microsoft YaHei" w:hAnsi="Microsoft YaHei" w:eastAsia="Microsoft YaHei"/>
           <w:lang w:val="en-US" w:eastAsia="zh-CN"/>
         </w:rPr>
-        <w:t>折叠后往会话里注入一句提醒：规模 + 存成哪条记忆 + 怎么打开；只带指针、不搬正文、不唤醒新一轮</w:t>
+        <w:t>折叠后注入提醒：最多 3 条负面结论 / 3 条工具失败 + 规模 + 记忆 id；不搬全文、不唤醒新一轮</w:t>
       </w:r>
     </w:p>
     <w:p>
@@ -1272,7 +1272,7 @@
           <w:rFonts w:ascii="Microsoft YaHei" w:hAnsi="Microsoft YaHei" w:eastAsia="Microsoft YaHei"/>
           <w:lang w:val="en-US" w:eastAsia="zh-CN"/>
         </w:rPr>
-        <w:t>模型可能不去看 —— 这是已知缺口</w:t>
+        <w:t>模型可能不 open；提醒是唯一保证通道，记忆是第二机会</w:t>
       </w:r>
     </w:p>
     <w:p>
@@ -1963,7 +1963,7 @@
           <w:rFonts w:ascii="Microsoft YaHei" w:hAnsi="Microsoft YaHei" w:eastAsia="Microsoft YaHei"/>
           <w:lang w:val="en-US" w:eastAsia="zh-CN"/>
         </w:rPr>
-        <w:t>一组维护功能（衰减降权 / 按龄归档 / 超量归档 / 验证记录有界化 / 孤儿任务回收 / 该用未用 / 技能评审），可手动触发、可整体关闭</w:t>
+        <w:t>一组维护功能（衰减降权 / 按龄归档 / 超量归档 / 验证记录有界化 / 孤儿任务回收 / 折叠快照清理 / 该用未用 / 技能评审），可手动触发、可整体关闭</w:t>
       </w:r>
     </w:p>
     <w:p>
@@ -2260,7 +2260,7 @@
           <w:rFonts w:ascii="Microsoft YaHei" w:hAnsi="Microsoft YaHei" w:eastAsia="Microsoft YaHei"/>
           <w:lang w:val="en-US" w:eastAsia="zh-CN"/>
         </w:rPr>
-        <w:t>派活不靠"把上下文塞过去"；自己的复杂活也能用同一张图规划与收尾</w:t>
+        <w:t>派活不靠"把上下文塞过去"；也是任务的档案/寻址空间（已完成里程碑、依赖、重要结论 id）</w:t>
       </w:r>
     </w:p>
     <w:p>
@@ -2281,7 +2281,7 @@
           <w:rFonts w:ascii="Microsoft YaHei" w:hAnsi="Microsoft YaHei" w:eastAsia="Microsoft YaHei"/>
           <w:lang w:val="en-US" w:eastAsia="zh-CN"/>
         </w:rPr>
-        <w:t>主模型先写一张图（一条短时记忆），派活只给图 id；子代理自己读。何时该开图由系统提示给出三问判据（跨会话 / 被折叠 / 有并行 / 需事后说清，任一为是就开，都否就别加仪式）</w:t>
+        <w:t>主模型先写一张图（一条短时记忆）；派活只给图 id，子代理自己读。重要结论用 conclusion 标签、读时派生；会跨会话/会产出多条记忆时才开图，未完成步骤用宿主 todo；跨会话开新图 + links，不改旧图</w:t>
       </w:r>
     </w:p>
     <w:p>
@@ -2302,7 +2302,7 @@
           <w:rFonts w:ascii="Microsoft YaHei" w:hAnsi="Microsoft YaHei" w:eastAsia="Microsoft YaHei"/>
           <w:lang w:val="en-US" w:eastAsia="zh-CN"/>
         </w:rPr>
-        <w:t>父子多级嵌套未验证；小事开图是净亏损（多几次往返）</w:t>
+        <w:t>父子多级嵌套未验证；小事开图是净亏损（多几次往返）；图不复制结论正文</w:t>
       </w:r>
     </w:p>
     <w:p>
@@ -2620,7 +2620,7 @@
           <w:b/>
           <w:lang w:val="en-US" w:eastAsia="zh-CN"/>
         </w:rPr>
-        <w:t>八、它对外提供的工具（17 个）</w:t>
+        <w:t>八、它对外提供的工具（19 个）</w:t>
       </w:r>
     </w:p>
     <w:p>
@@ -2961,7 +2961,7 @@
           <w:b/>
           <w:lang w:val="en-US" w:eastAsia="zh-CN"/>
         </w:rPr>
-        <w:t>多 agent</w:t>
+        <w:t>任务图</w:t>
       </w:r>
     </w:p>
     <w:p>
@@ -2982,7 +2982,7 @@
           <w:rFonts w:ascii="Microsoft YaHei" w:hAnsi="Microsoft YaHei" w:eastAsia="Microsoft YaHei"/>
           <w:lang w:val="en-US" w:eastAsia="zh-CN"/>
         </w:rPr>
-        <w:t>task_open · task_update · task_close</w:t>
+        <w:t>task_open · task_update · task_close · task_done · task_cite</w:t>
       </w:r>
     </w:p>
     <w:p>
@@ -3003,7 +3003,7 @@
           <w:rFonts w:ascii="Microsoft YaHei" w:hAnsi="Microsoft YaHei" w:eastAsia="Microsoft YaHei"/>
           <w:lang w:val="en-US" w:eastAsia="zh-CN"/>
         </w:rPr>
-        <w:t>开任务图、填回执、收尾汇总</w:t>
+        <w:t>开图、填回执、收尾汇总、记已完成里程碑、登记依赖</w:t>
       </w:r>
     </w:p>
     <w:p>
@@ -3024,7 +3024,7 @@
           <w:rFonts w:ascii="Microsoft YaHei" w:hAnsi="Microsoft YaHei" w:eastAsia="Microsoft YaHei"/>
           <w:lang w:val="en-US" w:eastAsia="zh-CN"/>
         </w:rPr>
-        <w:t>单写者；创建者会话没了就只能等超期回收</w:t>
+        <w:t>单写者；创建者会话没了就只能等超期回收；图是档案，不是待办清单</w:t>
       </w:r>
     </w:p>
     <w:p>
@@ -3079,7 +3079,7 @@
           <w:rFonts w:ascii="Microsoft YaHei" w:hAnsi="Microsoft YaHei" w:eastAsia="Microsoft YaHei"/>
           <w:lang w:val="en-US" w:eastAsia="zh-CN"/>
         </w:rPr>
-        <w:t>提议新建任务型技能</w:t>
+        <w:t>提议新建任务型技能（失败→修好 / 记忆反复 / 外部改写）</w:t>
       </w:r>
     </w:p>
     <w:p>
@@ -3100,7 +3100,7 @@
           <w:rFonts w:ascii="Microsoft YaHei" w:hAnsi="Microsoft YaHei" w:eastAsia="Microsoft YaHei"/>
           <w:lang w:val="en-US" w:eastAsia="zh-CN"/>
         </w:rPr>
-        <w:t>还要过验证与目录上限，不是"提议即建"</w:t>
+        <w:t>还要过来源门槛、独立验证与目录上限，不是"提议即建"</w:t>
       </w:r>
     </w:p>
     <w:p>
@@ -3803,7 +3803,7 @@
           <w:rFonts w:ascii="Microsoft YaHei" w:hAnsi="Microsoft YaHei" w:eastAsia="Microsoft YaHei"/>
           <w:lang w:val="en-US" w:eastAsia="zh-CN"/>
         </w:rPr>
-        <w:t>刻意"一句话一条"（约 2.6k 字符 / 23 条）；有回归检查盯着：不许出现字面星号、不许把参数细节抄回来、总长度不许涨</w:t>
+        <w:t>刻意"一句话一条"（约 3.5k 字符 / 25 条）；有回归检查盯着：不许出现字面星号、不许把参数细节抄回来、总长度不许涨</w:t>
       </w:r>
     </w:p>
     <w:p>

</xml_diff>